<commit_message>
Restructuration de la fiche de révision par parties
Co-Authored-By: Claude Opus 5.5 <noreply@anthropic.com>
Claude-Session: https://claude.ai/code/session_01HnpDwuMrN4azqfdCpX8D9h
</commit_message>
<xml_diff>
--- a/fiches-2i2d/Exercices_2I2D_avec_corrige.docx
+++ b/fiches-2i2d/Exercices_2I2D_avec_corrige.docx
@@ -2315,6 +2315,78 @@
     </w:lvl>
   </w:abstractNum>
   <w:abstractNum w:abstractNumId="2" w15:restartNumberingAfterBreak="0">
+    <w:multiLevelType w:val="hybridMultilevel"/>
+    <w:lvl w:ilvl="0" w15:tentative="1">
+      <w:start w:val="1"/>
+      <w:numFmt w:val="decimal"/>
+      <w:lvlText w:val="%1."/>
+      <w:lvlJc w:val="left"/>
+      <w:pPr>
+        <w:ind w:left="400" w:hanging="300"/>
+      </w:pPr>
+    </w:lvl>
+  </w:abstractNum>
+  <w:abstractNum w:abstractNumId="3" w15:restartNumberingAfterBreak="0">
+    <w:multiLevelType w:val="hybridMultilevel"/>
+    <w:lvl w:ilvl="0" w15:tentative="1">
+      <w:start w:val="1"/>
+      <w:numFmt w:val="decimal"/>
+      <w:lvlText w:val="%1."/>
+      <w:lvlJc w:val="left"/>
+      <w:pPr>
+        <w:ind w:left="400" w:hanging="300"/>
+      </w:pPr>
+    </w:lvl>
+  </w:abstractNum>
+  <w:abstractNum w:abstractNumId="4" w15:restartNumberingAfterBreak="0">
+    <w:multiLevelType w:val="hybridMultilevel"/>
+    <w:lvl w:ilvl="0" w15:tentative="1">
+      <w:start w:val="1"/>
+      <w:numFmt w:val="decimal"/>
+      <w:lvlText w:val="%1."/>
+      <w:lvlJc w:val="left"/>
+      <w:pPr>
+        <w:ind w:left="400" w:hanging="300"/>
+      </w:pPr>
+    </w:lvl>
+  </w:abstractNum>
+  <w:abstractNum w:abstractNumId="5" w15:restartNumberingAfterBreak="0">
+    <w:multiLevelType w:val="hybridMultilevel"/>
+    <w:lvl w:ilvl="0" w15:tentative="1">
+      <w:start w:val="1"/>
+      <w:numFmt w:val="decimal"/>
+      <w:lvlText w:val="%1."/>
+      <w:lvlJc w:val="left"/>
+      <w:pPr>
+        <w:ind w:left="400" w:hanging="300"/>
+      </w:pPr>
+    </w:lvl>
+  </w:abstractNum>
+  <w:abstractNum w:abstractNumId="6" w15:restartNumberingAfterBreak="0">
+    <w:multiLevelType w:val="hybridMultilevel"/>
+    <w:lvl w:ilvl="0" w15:tentative="1">
+      <w:start w:val="1"/>
+      <w:numFmt w:val="decimal"/>
+      <w:lvlText w:val="%1."/>
+      <w:lvlJc w:val="left"/>
+      <w:pPr>
+        <w:ind w:left="400" w:hanging="300"/>
+      </w:pPr>
+    </w:lvl>
+  </w:abstractNum>
+  <w:abstractNum w:abstractNumId="7" w15:restartNumberingAfterBreak="0">
+    <w:multiLevelType w:val="hybridMultilevel"/>
+    <w:lvl w:ilvl="0" w15:tentative="1">
+      <w:start w:val="1"/>
+      <w:numFmt w:val="decimal"/>
+      <w:lvlText w:val="%1."/>
+      <w:lvlJc w:val="left"/>
+      <w:pPr>
+        <w:ind w:left="400" w:hanging="300"/>
+      </w:pPr>
+    </w:lvl>
+  </w:abstractNum>
+  <w:abstractNum w:abstractNumId="8" w15:restartNumberingAfterBreak="0">
     <w:multiLevelType w:val="hybridMultilevel"/>
     <w:lvl w:ilvl="0" w15:tentative="1">
       <w:start w:val="1"/>

</xml_diff>